<commit_message>
Wire live URL, fix CI badge, remove email, restore QR maker
</commit_message>
<xml_diff>
--- a/Bull-Invest-Investor-One-Pager.docx
+++ b/Bull-Invest-Investor-One-Pager.docx
@@ -161,7 +161,7 @@
         <w:spacing w:after="80"/>
       </w:pPr>
       <w:r>
-        <w:t>Digital-only banking is large and growing fast. Independent estimates put the global neobanking market at roughly $310–385 billion in 2026, expanding at ~36–46% CAGR toward the trillions by 2030, with 400M+ neobank accounts worldwide. Personal-finance applications represent about 70% of digital-only banking services — Bull Invest's core focus. (Sources: Precedence Research; Grand View Research; Research and Markets, 2026.)</w:t>
+        <w:t>Digital-only banking is large and growing fast. Independent estimates put the global neobanking market at roughly $310-385 billion in 2026, expanding at ~36-46% CAGR toward the trillions by 2030, with 400M+ neobank accounts worldwide. Personal-finance applications represent about 70% of digital-only banking services - Bull Invest's core focus. (Sources: Precedence Research; Grand View Research; Research and Markets, 2026.)</w:t>
       </w:r>
     </w:p>
     <w:p>
@@ -190,7 +190,7 @@
         <w:t>Aggregation + cash in one</w:t>
       </w:r>
       <w:r>
-        <w:t xml:space="preserve"> — most apps either track accounts (Mint/Monarch) or are a neobank; Bull Invest combines both.</w:t>
+        <w:t xml:space="preserve"> - most apps either track accounts (Mint/Monarch) or are a neobank; Bull Invest combines both.</w:t>
       </w:r>
     </w:p>
     <w:p>
@@ -206,7 +206,7 @@
         <w:t>Fee elimination as a hook</w:t>
       </w:r>
       <w:r>
-        <w:t xml:space="preserve"> — zero ATM fees is a concrete, provable promise that drives adoption.</w:t>
+        <w:t xml:space="preserve"> - zero ATM fees is a concrete, provable promise that drives adoption.</w:t>
       </w:r>
     </w:p>
     <w:p>
@@ -222,7 +222,7 @@
         <w:t>Trust by design</w:t>
       </w:r>
       <w:r>
-        <w:t xml:space="preserve"> — read-only, bank-grade security messaging, transparency, and accessibility broaden the addressable user base.</w:t>
+        <w:t xml:space="preserve"> - read-only, bank-grade security messaging, transparency, and accessibility broaden the addressable user base.</w:t>
       </w:r>
     </w:p>
     <w:p>
@@ -272,8 +272,22 @@
         <w:t>Status:</w:t>
       </w:r>
       <w:r>
-        <w:t xml:space="preserve"> working interactive demo — multi-bank dashboard, calculators, 6 languages, PWA, automated tests passing. Not yet a licensed bank.</w:t>
+        <w:t xml:space="preserve"> working interactive demo - multi-bank dashboard, calculators, 6 languages, PWA, automated tests passing. Not yet a licensed bank.</w:t>
       </w:r>
+    </w:p>
+    <w:p>
+      <w:pPr>
+        <w:pStyle w:val="ListBullet"/>
+        <w:spacing w:after="20"/>
+      </w:pPr>
+      <w:r/>
+      <w:r>
+        <w:rPr>
+          <w:b/>
+        </w:rPr>
+        <w:t>Idea &amp; concept originator: Angel Gallegos.</w:t>
+      </w:r>
+      <w:r/>
     </w:p>
     <w:p>
       <w:pPr>
@@ -288,22 +302,8 @@
         <w:t>Built, developed and tested A-to-Z by Botros Saleb</w:t>
       </w:r>
       <w:r>
-        <w:t xml:space="preserve"> (founder/builder).</w:t>
+        <w:t xml:space="preserve"> (builder, developer &amp; tester).</w:t>
       </w:r>
-    </w:p>
-    <w:p>
-      <w:pPr>
-        <w:pStyle w:val="ListBullet"/>
-        <w:spacing w:after="20"/>
-      </w:pPr>
-      <w:r/>
-      <w:r>
-        <w:rPr>
-          <w:b/>
-        </w:rPr>
-        <w:t>Original idea &amp; ongoing feedback: Angel Gallegos.</w:t>
-      </w:r>
-      <w:r/>
     </w:p>
     <w:p>
       <w:pPr>

</xml_diff>

<commit_message>
v2.0: streak ring + levels; update QA & investor docs
</commit_message>
<xml_diff>
--- a/Bull-Invest-Investor-One-Pager.docx
+++ b/Bull-Invest-Investor-One-Pager.docx
@@ -55,7 +55,7 @@
         <w:spacing w:after="80"/>
       </w:pPr>
       <w:r>
-        <w:t>People hold money across many institutions — checking, high-yield savings, a brokerage, a 401(k), a mortgage — and have no single, trustworthy place to see and manage it. They also lose money to avoidable fees (ATM surcharges, foreign-transaction fees) and lack simple, transparent tools to plan.</w:t>
+        <w:t>People hold money across many institutions - checking, high-yield savings, a brokerage, a 401(k), a mortgage - and have no single, trustworthy place to see and manage it. They also lose money to avoidable fees (ATM surcharges, foreign-transaction fees) and lack simple, transparent tools to plan.</w:t>
       </w:r>
     </w:p>
     <w:p>
@@ -76,7 +76,7 @@
         <w:spacing w:after="80"/>
       </w:pPr>
       <w:r>
-        <w:t>Bull Invest is one secure dashboard that unifies every account across every bank, adds a zero-fee ATM debit experience, and gives people clear, verified planning calculators — all multilingual and fully accessible.</w:t>
+        <w:t>Bull Invest is one secure dashboard that unifies every account across every bank, adds a zero-fee ATM debit experience, and gives people clear, verified planning calculators - all multilingual and fully accessible.</w:t>
       </w:r>
     </w:p>
     <w:p>
@@ -92,7 +92,7 @@
         <w:t>All banks in one view</w:t>
       </w:r>
       <w:r>
-        <w:t xml:space="preserve"> — Chase, Wells Fargo, Schwab, Fidelity and more.</w:t>
+        <w:t xml:space="preserve"> - Chase, Wells Fargo, Schwab, Fidelity and more.</w:t>
       </w:r>
     </w:p>
     <w:p>
@@ -108,7 +108,7 @@
         <w:t>Zero ATM fees worldwide</w:t>
       </w:r>
       <w:r>
-        <w:t xml:space="preserve"> — automatic surcharge reimbursement (the proven Schwab/Fidelity model).</w:t>
+        <w:t xml:space="preserve"> - automatic surcharge reimbursement (the proven Schwab/Fidelity model).</w:t>
       </w:r>
     </w:p>
     <w:p>
@@ -124,7 +124,7 @@
         <w:t>Plan with confidence</w:t>
       </w:r>
       <w:r>
-        <w:t xml:space="preserve"> — investment, loan, retirement and savings calculators, unit-tested for accuracy.</w:t>
+        <w:t xml:space="preserve"> - investment, loan, retirement and savings calculators, unit-tested for accuracy.</w:t>
       </w:r>
     </w:p>
     <w:p>
@@ -140,7 +140,76 @@
         <w:t>Built for everyone</w:t>
       </w:r>
       <w:r>
-        <w:t xml:space="preserve"> — 6 languages (incl. Arabic RTL), WCAG-AA accessibility, dark mode, installable app.</w:t>
+        <w:t xml:space="preserve"> - 6 languages (incl. Arabic RTL), WCAG-AA accessibility, dark mode, installable app.</w:t>
+      </w:r>
+    </w:p>
+    <w:p>
+      <w:pPr>
+        <w:spacing w:before="140" w:after="40"/>
+      </w:pPr>
+      <w:r>
+        <w:rPr>
+          <w:b/>
+          <w:color w:val="0E9C66"/>
+          <w:sz w:val="23"/>
+        </w:rPr>
+        <w:t>Engagement built in (already shipped in the demo)</w:t>
+      </w:r>
+    </w:p>
+    <w:p>
+      <w:pPr>
+        <w:spacing w:after="80"/>
+      </w:pPr>
+      <w:r>
+        <w:t>Features chosen from 2026 retention research are already live in the prototype, de-risking the product:</w:t>
+      </w:r>
+    </w:p>
+    <w:p>
+      <w:pPr>
+        <w:pStyle w:val="ListBullet"/>
+        <w:spacing w:after="20"/>
+      </w:pPr>
+      <w:r/>
+      <w:r>
+        <w:rPr>
+          <w:b/>
+        </w:rPr>
+        <w:t>Personalized insights</w:t>
+      </w:r>
+      <w:r>
+        <w:t xml:space="preserve"> (~+27% daily use) - saved-this-month, goals-on-track at a glance.</w:t>
+      </w:r>
+    </w:p>
+    <w:p>
+      <w:pPr>
+        <w:pStyle w:val="ListBullet"/>
+        <w:spacing w:after="20"/>
+      </w:pPr>
+      <w:r/>
+      <w:r>
+        <w:rPr>
+          <w:b/>
+        </w:rPr>
+        <w:t>Gamified goals, streaks &amp; levels</w:t>
+      </w:r>
+      <w:r>
+        <w:t xml:space="preserve"> (~+32% retention) - a savings-streak progress ring, levels, and on-track badges.</w:t>
+      </w:r>
+    </w:p>
+    <w:p>
+      <w:pPr>
+        <w:pStyle w:val="ListBullet"/>
+        <w:spacing w:after="20"/>
+      </w:pPr>
+      <w:r/>
+      <w:r>
+        <w:rPr>
+          <w:b/>
+        </w:rPr>
+        <w:t>Monthly budget view</w:t>
+      </w:r>
+      <w:r>
+        <w:t xml:space="preserve"> - category spending vs budget, the top-requested PFM feature.</w:t>
       </w:r>
     </w:p>
     <w:p>
@@ -219,10 +288,10 @@
         <w:rPr>
           <w:b/>
         </w:rPr>
-        <w:t>Trust by design</w:t>
+        <w:t>Engagement + trust by design</w:t>
       </w:r>
       <w:r>
-        <w:t xml:space="preserve"> - read-only, bank-grade security messaging, transparency, and accessibility broaden the addressable user base.</w:t>
+        <w:t xml:space="preserve"> - gamification, accessibility, and 6 languages broaden the addressable user base.</w:t>
       </w:r>
     </w:p>
     <w:p>
@@ -272,7 +341,7 @@
         <w:t>Status:</w:t>
       </w:r>
       <w:r>
-        <w:t xml:space="preserve"> working interactive demo - multi-bank dashboard, calculators, 6 languages, PWA, automated tests passing. Not yet a licensed bank.</w:t>
+        <w:t xml:space="preserve"> working interactive demo - multi-bank dashboard, calculators, 6 languages, gamified goals, budget view, PWA, automated tests passing. Not yet a licensed bank.</w:t>
       </w:r>
     </w:p>
     <w:p>

</xml_diff>